<commit_message>
Document des résultats : nouvelles captures, logo en page de garde, description de l'interface et des garde-fous d'usage
Co-Authored-By: Claude Opus 5.5 <noreply@anthropic.com>
Claude-Session: https://claude.ai/code/session_013JXMEQCNGgRjDzvz3X6fC9
</commit_message>
<xml_diff>
--- a/docs/livrables/Resultats_ANALYSPME_pour_memoire.docx
+++ b/docs/livrables/Resultats_ANALYSPME_pour_memoire.docx
@@ -2,6 +2,46 @@
 <file path=word/document.xml><?xml version="1.0" encoding="utf-8"?>
 <w:document xmlns:wpc="http://schemas.microsoft.com/office/word/2010/wordprocessingCanvas" xmlns:mo="http://schemas.microsoft.com/office/mac/office/2008/main" xmlns:mc="http://schemas.openxmlformats.org/markup-compatibility/2006" xmlns:mv="urn:schemas-microsoft-com:mac:vml" xmlns:o="urn:schemas-microsoft-com:office:office" xmlns:r="http://schemas.openxmlformats.org/officeDocument/2006/relationships" xmlns:m="http://schemas.openxmlformats.org/officeDocument/2006/math" xmlns:v="urn:schemas-microsoft-com:vml" xmlns:wp14="http://schemas.microsoft.com/office/word/2010/wordprocessingDrawing" xmlns:wp="http://schemas.openxmlformats.org/drawingml/2006/wordprocessingDrawing" xmlns:w10="urn:schemas-microsoft-com:office:word" xmlns:w="http://schemas.openxmlformats.org/wordprocessingml/2006/main" xmlns:w14="http://schemas.microsoft.com/office/word/2010/wordml" xmlns:wpg="http://schemas.microsoft.com/office/word/2010/wordprocessingGroup" xmlns:wpi="http://schemas.microsoft.com/office/word/2010/wordprocessingInk" xmlns:wne="http://schemas.microsoft.com/office/word/2006/wordml" xmlns:wps="http://schemas.microsoft.com/office/word/2010/wordprocessingShape" mc:Ignorable="w14 wp14">
   <w:body>
+    <w:p/>
+    <w:p>
+      <w:pPr>
+        <w:jc w:val="center"/>
+      </w:pPr>
+      <w:r>
+        <w:drawing>
+          <wp:inline xmlns:a="http://schemas.openxmlformats.org/drawingml/2006/main" xmlns:pic="http://schemas.openxmlformats.org/drawingml/2006/picture">
+            <wp:extent cx="1296000" cy="1181887"/>
+            <wp:docPr id="1" name="Picture 1"/>
+            <wp:cNvGraphicFramePr>
+              <a:graphicFrameLocks noChangeAspect="1"/>
+            </wp:cNvGraphicFramePr>
+            <a:graphic>
+              <a:graphicData uri="http://schemas.openxmlformats.org/drawingml/2006/picture">
+                <pic:pic>
+                  <pic:nvPicPr>
+                    <pic:cNvPr id="0" name="logo.png"/>
+                    <pic:cNvPicPr/>
+                  </pic:nvPicPr>
+                  <pic:blipFill>
+                    <a:blip r:embed="rId9"/>
+                    <a:stretch>
+                      <a:fillRect/>
+                    </a:stretch>
+                  </pic:blipFill>
+                  <pic:spPr>
+                    <a:xfrm>
+                      <a:off x="0" y="0"/>
+                      <a:ext cx="1296000" cy="1181887"/>
+                    </a:xfrm>
+                    <a:prstGeom prst="rect"/>
+                  </pic:spPr>
+                </pic:pic>
+              </a:graphicData>
+            </a:graphic>
+          </wp:inline>
+        </w:drawing>
+      </w:r>
+    </w:p>
     <w:p>
       <w:pPr>
         <w:jc w:val="center"/>
@@ -12,8 +52,6 @@
           <w:color w:val="007A5E"/>
           <w:sz w:val="60"/>
         </w:rPr>
-        <w:br/>
-        <w:br/>
         <w:t>ANALYS'PME</w:t>
       </w:r>
     </w:p>
@@ -60,7 +98,7 @@
         <w:br/>
         <w:t>Ivan Leny — Master 2, ISSEA</w:t>
         <w:br/>
-        <w:t>Version du 02/10/2026</w:t>
+        <w:t>Version du 06/10/2026</w:t>
       </w:r>
     </w:p>
     <w:p>
@@ -5006,7 +5044,16 @@
           <w:b w:val="0"/>
           <w:i w:val="0"/>
         </w:rPr>
-        <w:t>Quatre parcours (Consulter, Commenter un indicateur, Note d'analyse, Note stratégique) et une page « Base documentaire ». Identité visuelle : nom ANALYS'PME, couleurs vert, rouge et jaune, rappel du drapeau national.</w:t>
+        <w:t>Quatre parcours (Consulter, Commenter un indicateur, Note d'analyse, Note stratégique) et une page « Base documentaire ». Identité visuelle : logo du MINPMEESA placé avant le nom ANALYS'PME, couleurs nationales (vert, rouge, jaune) en version vive, sans émoticônes ; chaque énoncé est présenté comme une carte étiquetée CONSTAT ou PERSPECTIVE, suivie de ses sources. Aucune ressource externe n'est chargée : l'interface fonctionne hors ligne.</w:t>
+      </w:r>
+    </w:p>
+    <w:p>
+      <w:r>
+        <w:rPr>
+          <w:b w:val="0"/>
+          <w:i w:val="0"/>
+        </w:rPr>
+        <w:t>Deux garde-fous d'usage complètent l'interface : (1) en cas de refus d'une question, l'outil propose des intitulés d'indicateurs de l'Annuaire proches de la question, chacun vérifié au-dessus du seuil d'abstention (le seuil n'est pas modifié) ; (2) si la réponse du modèle de langage est inexploitable (format invalide, refus, moins de deux constats sourcés après contrôle, ou attente supérieure à 240 s), le commentaire est rédigé par les gabarits et ce repli est signalé. Les évaluations du modèle (H1, H2, Tableau 3.2) désactivent ce repli pour mesurer le modèle seul.</w:t>
       </w:r>
     </w:p>
     <w:p>
@@ -5464,7 +5511,7 @@
         <w:drawing>
           <wp:inline xmlns:a="http://schemas.openxmlformats.org/drawingml/2006/main" xmlns:pic="http://schemas.openxmlformats.org/drawingml/2006/picture">
             <wp:extent cx="5400000" cy="4242857"/>
-            <wp:docPr id="1" name="Picture 1"/>
+            <wp:docPr id="2" name="Picture 2"/>
             <wp:cNvGraphicFramePr>
               <a:graphicFrameLocks noChangeAspect="1"/>
             </wp:cNvGraphicFramePr>
@@ -5473,66 +5520,6 @@
                 <pic:pic>
                   <pic:nvPicPr>
                     <pic:cNvPr id="0" name="1_consulter.png"/>
-                    <pic:cNvPicPr/>
-                  </pic:nvPicPr>
-                  <pic:blipFill>
-                    <a:blip r:embed="rId9"/>
-                    <a:stretch>
-                      <a:fillRect/>
-                    </a:stretch>
-                  </pic:blipFill>
-                  <pic:spPr>
-                    <a:xfrm>
-                      <a:off x="0" y="0"/>
-                      <a:ext cx="5400000" cy="4242857"/>
-                    </a:xfrm>
-                    <a:prstGeom prst="rect"/>
-                  </pic:spPr>
-                </pic:pic>
-              </a:graphicData>
-            </a:graphic>
-          </wp:inline>
-        </w:drawing>
-      </w:r>
-    </w:p>
-    <w:p>
-      <w:pPr>
-        <w:jc w:val="center"/>
-      </w:pPr>
-      <w:r>
-        <w:rPr>
-          <w:b/>
-          <w:sz w:val="20"/>
-        </w:rPr>
-        <w:t>Figure R1 — Parcours « Consulter » : réponse sourcée (document, page) ou refus motivé hors corpus</w:t>
-      </w:r>
-      <w:r>
-        <w:rPr>
-          <w:i/>
-          <w:color w:val="5B6770"/>
-          <w:sz w:val="18"/>
-        </w:rPr>
-        <w:br/>
-        <w:t>Source : data/outputs/captures/1_consulter.png</w:t>
-      </w:r>
-    </w:p>
-    <w:p>
-      <w:pPr>
-        <w:jc w:val="center"/>
-      </w:pPr>
-      <w:r>
-        <w:drawing>
-          <wp:inline xmlns:a="http://schemas.openxmlformats.org/drawingml/2006/main" xmlns:pic="http://schemas.openxmlformats.org/drawingml/2006/picture">
-            <wp:extent cx="5400000" cy="4242857"/>
-            <wp:docPr id="2" name="Picture 2"/>
-            <wp:cNvGraphicFramePr>
-              <a:graphicFrameLocks noChangeAspect="1"/>
-            </wp:cNvGraphicFramePr>
-            <a:graphic>
-              <a:graphicData uri="http://schemas.openxmlformats.org/drawingml/2006/picture">
-                <pic:pic>
-                  <pic:nvPicPr>
-                    <pic:cNvPr id="0" name="2_commenter.png"/>
                     <pic:cNvPicPr/>
                   </pic:nvPicPr>
                   <pic:blipFill>
@@ -5564,7 +5551,67 @@
           <w:b/>
           <w:sz w:val="20"/>
         </w:rPr>
-        <w:t>Figure R2 — Parcours « Commenter un indicateur » : commentaire et source de chaque valeur</w:t>
+        <w:t>Figure R1 — Parcours « Consulter » : extraits sourcés (document, page) ; refus motivé et suggestions sinon</w:t>
+      </w:r>
+      <w:r>
+        <w:rPr>
+          <w:i/>
+          <w:color w:val="5B6770"/>
+          <w:sz w:val="18"/>
+        </w:rPr>
+        <w:br/>
+        <w:t>Source : data/outputs/captures/1_consulter.png</w:t>
+      </w:r>
+    </w:p>
+    <w:p>
+      <w:pPr>
+        <w:jc w:val="center"/>
+      </w:pPr>
+      <w:r>
+        <w:drawing>
+          <wp:inline xmlns:a="http://schemas.openxmlformats.org/drawingml/2006/main" xmlns:pic="http://schemas.openxmlformats.org/drawingml/2006/picture">
+            <wp:extent cx="5400000" cy="4242857"/>
+            <wp:docPr id="3" name="Picture 3"/>
+            <wp:cNvGraphicFramePr>
+              <a:graphicFrameLocks noChangeAspect="1"/>
+            </wp:cNvGraphicFramePr>
+            <a:graphic>
+              <a:graphicData uri="http://schemas.openxmlformats.org/drawingml/2006/picture">
+                <pic:pic>
+                  <pic:nvPicPr>
+                    <pic:cNvPr id="0" name="2_commenter.png"/>
+                    <pic:cNvPicPr/>
+                  </pic:nvPicPr>
+                  <pic:blipFill>
+                    <a:blip r:embed="rId11"/>
+                    <a:stretch>
+                      <a:fillRect/>
+                    </a:stretch>
+                  </pic:blipFill>
+                  <pic:spPr>
+                    <a:xfrm>
+                      <a:off x="0" y="0"/>
+                      <a:ext cx="5400000" cy="4242857"/>
+                    </a:xfrm>
+                    <a:prstGeom prst="rect"/>
+                  </pic:spPr>
+                </pic:pic>
+              </a:graphicData>
+            </a:graphic>
+          </wp:inline>
+        </w:drawing>
+      </w:r>
+    </w:p>
+    <w:p>
+      <w:pPr>
+        <w:jc w:val="center"/>
+      </w:pPr>
+      <w:r>
+        <w:rPr>
+          <w:b/>
+          <w:sz w:val="20"/>
+        </w:rPr>
+        <w:t>Figure R2 — Parcours « Commenter un indicateur » : énoncés étiquetés CONSTAT / PERSPECTIVE et source de chaque valeur</w:t>
       </w:r>
       <w:r>
         <w:rPr>
@@ -5584,7 +5631,7 @@
         <w:drawing>
           <wp:inline xmlns:a="http://schemas.openxmlformats.org/drawingml/2006/main" xmlns:pic="http://schemas.openxmlformats.org/drawingml/2006/picture">
             <wp:extent cx="5400000" cy="4242857"/>
-            <wp:docPr id="3" name="Picture 3"/>
+            <wp:docPr id="4" name="Picture 4"/>
             <wp:cNvGraphicFramePr>
               <a:graphicFrameLocks noChangeAspect="1"/>
             </wp:cNvGraphicFramePr>
@@ -5596,7 +5643,7 @@
                     <pic:cNvPicPr/>
                   </pic:nvPicPr>
                   <pic:blipFill>
-                    <a:blip r:embed="rId11"/>
+                    <a:blip r:embed="rId12"/>
                     <a:stretch>
                       <a:fillRect/>
                     </a:stretch>
@@ -5644,7 +5691,7 @@
         <w:drawing>
           <wp:inline xmlns:a="http://schemas.openxmlformats.org/drawingml/2006/main" xmlns:pic="http://schemas.openxmlformats.org/drawingml/2006/picture">
             <wp:extent cx="5400000" cy="4242857"/>
-            <wp:docPr id="4" name="Picture 4"/>
+            <wp:docPr id="5" name="Picture 5"/>
             <wp:cNvGraphicFramePr>
               <a:graphicFrameLocks noChangeAspect="1"/>
             </wp:cNvGraphicFramePr>
@@ -5656,7 +5703,7 @@
                     <pic:cNvPicPr/>
                   </pic:nvPicPr>
                   <pic:blipFill>
-                    <a:blip r:embed="rId12"/>
+                    <a:blip r:embed="rId13"/>
                     <a:stretch>
                       <a:fillRect/>
                     </a:stretch>
@@ -5703,8 +5750,8 @@
       <w:r>
         <w:drawing>
           <wp:inline xmlns:a="http://schemas.openxmlformats.org/drawingml/2006/main" xmlns:pic="http://schemas.openxmlformats.org/drawingml/2006/picture">
-            <wp:extent cx="5400000" cy="5014286"/>
-            <wp:docPr id="5" name="Picture 5"/>
+            <wp:extent cx="5400000" cy="4242857"/>
+            <wp:docPr id="6" name="Picture 6"/>
             <wp:cNvGraphicFramePr>
               <a:graphicFrameLocks noChangeAspect="1"/>
             </wp:cNvGraphicFramePr>
@@ -5716,7 +5763,7 @@
                     <pic:cNvPicPr/>
                   </pic:nvPicPr>
                   <pic:blipFill>
-                    <a:blip r:embed="rId13"/>
+                    <a:blip r:embed="rId14"/>
                     <a:stretch>
                       <a:fillRect/>
                     </a:stretch>
@@ -5724,7 +5771,7 @@
                   <pic:spPr>
                     <a:xfrm>
                       <a:off x="0" y="0"/>
-                      <a:ext cx="5400000" cy="5014286"/>
+                      <a:ext cx="5400000" cy="4242857"/>
                     </a:xfrm>
                     <a:prstGeom prst="rect"/>
                   </pic:spPr>
@@ -7700,7 +7747,7 @@
         <w:drawing>
           <wp:inline xmlns:a="http://schemas.openxmlformats.org/drawingml/2006/main" xmlns:pic="http://schemas.openxmlformats.org/drawingml/2006/picture">
             <wp:extent cx="5580000" cy="2945000"/>
-            <wp:docPr id="6" name="Picture 6"/>
+            <wp:docPr id="7" name="Picture 7"/>
             <wp:cNvGraphicFramePr>
               <a:graphicFrameLocks noChangeAspect="1"/>
             </wp:cNvGraphicFramePr>
@@ -7712,7 +7759,7 @@
                     <pic:cNvPicPr/>
                   </pic:nvPicPr>
                   <pic:blipFill>
-                    <a:blip r:embed="rId14"/>
+                    <a:blip r:embed="rId15"/>
                     <a:stretch>
                       <a:fillRect/>
                     </a:stretch>
@@ -7760,7 +7807,7 @@
         <w:drawing>
           <wp:inline xmlns:a="http://schemas.openxmlformats.org/drawingml/2006/main" xmlns:pic="http://schemas.openxmlformats.org/drawingml/2006/picture">
             <wp:extent cx="5580000" cy="2945000"/>
-            <wp:docPr id="7" name="Picture 7"/>
+            <wp:docPr id="8" name="Picture 8"/>
             <wp:cNvGraphicFramePr>
               <a:graphicFrameLocks noChangeAspect="1"/>
             </wp:cNvGraphicFramePr>
@@ -7772,7 +7819,7 @@
                     <pic:cNvPicPr/>
                   </pic:nvPicPr>
                   <pic:blipFill>
-                    <a:blip r:embed="rId15"/>
+                    <a:blip r:embed="rId16"/>
                     <a:stretch>
                       <a:fillRect/>
                     </a:stretch>
@@ -9615,7 +9662,7 @@
         <w:drawing>
           <wp:inline xmlns:a="http://schemas.openxmlformats.org/drawingml/2006/main" xmlns:pic="http://schemas.openxmlformats.org/drawingml/2006/picture">
             <wp:extent cx="5580000" cy="2945000"/>
-            <wp:docPr id="8" name="Picture 8"/>
+            <wp:docPr id="9" name="Picture 9"/>
             <wp:cNvGraphicFramePr>
               <a:graphicFrameLocks noChangeAspect="1"/>
             </wp:cNvGraphicFramePr>
@@ -9627,7 +9674,7 @@
                     <pic:cNvPicPr/>
                   </pic:nvPicPr>
                   <pic:blipFill>
-                    <a:blip r:embed="rId16"/>
+                    <a:blip r:embed="rId17"/>
                     <a:stretch>
                       <a:fillRect/>
                     </a:stretch>
@@ -10141,7 +10188,7 @@
         <w:drawing>
           <wp:inline xmlns:a="http://schemas.openxmlformats.org/drawingml/2006/main" xmlns:pic="http://schemas.openxmlformats.org/drawingml/2006/picture">
             <wp:extent cx="5580000" cy="2945000"/>
-            <wp:docPr id="9" name="Picture 9"/>
+            <wp:docPr id="10" name="Picture 10"/>
             <wp:cNvGraphicFramePr>
               <a:graphicFrameLocks noChangeAspect="1"/>
             </wp:cNvGraphicFramePr>
@@ -10153,7 +10200,7 @@
                     <pic:cNvPicPr/>
                   </pic:nvPicPr>
                   <pic:blipFill>
-                    <a:blip r:embed="rId17"/>
+                    <a:blip r:embed="rId18"/>
                     <a:stretch>
                       <a:fillRect/>
                     </a:stretch>
@@ -10912,7 +10959,7 @@
         <w:drawing>
           <wp:inline xmlns:a="http://schemas.openxmlformats.org/drawingml/2006/main" xmlns:pic="http://schemas.openxmlformats.org/drawingml/2006/picture">
             <wp:extent cx="4680000" cy="2470000"/>
-            <wp:docPr id="10" name="Picture 10"/>
+            <wp:docPr id="11" name="Picture 11"/>
             <wp:cNvGraphicFramePr>
               <a:graphicFrameLocks noChangeAspect="1"/>
             </wp:cNvGraphicFramePr>
@@ -10924,7 +10971,7 @@
                     <pic:cNvPicPr/>
                   </pic:nvPicPr>
                   <pic:blipFill>
-                    <a:blip r:embed="rId18"/>
+                    <a:blip r:embed="rId19"/>
                     <a:stretch>
                       <a:fillRect/>
                     </a:stretch>

</xml_diff>

<commit_message>
Présentation « rapport » de la note d'analyse et du commentaire (interface et Word) : introduction, principaux enseignements, chapitres, sections et tableaux en titres, paragraphes rédigés et sources ; vue de vérification conservée
Co-Authored-By: Claude Opus 5.5 <noreply@anthropic.com>
Claude-Session: https://claude.ai/code/session_013JXMEQCNGgRjDzvz3X6fC9
</commit_message>
<xml_diff>
--- a/docs/livrables/Resultats_ANALYSPME_pour_memoire.docx
+++ b/docs/livrables/Resultats_ANALYSPME_pour_memoire.docx
@@ -6753,7 +6753,7 @@
                 <w:b w:val="0"/>
                 <w:sz w:val="18"/>
               </w:rPr>
-              <w:t>n° 1340 (stock-pme-region, non validé)</w:t>
+              <w:t>n° 1661 (stock-pme-region, non validé)</w:t>
             </w:r>
           </w:p>
         </w:tc>
@@ -6862,7 +6862,7 @@
                 <w:b w:val="0"/>
                 <w:sz w:val="18"/>
               </w:rPr>
-              <w:t>n° 1340 (stock-pme-region, non validé)</w:t>
+              <w:t>n° 1661 (stock-pme-region, non validé)</w:t>
             </w:r>
           </w:p>
         </w:tc>
@@ -6974,7 +6974,7 @@
                 <w:b w:val="0"/>
                 <w:sz w:val="18"/>
               </w:rPr>
-              <w:t>n° 1351 (pme-typologie, non validé)</w:t>
+              <w:t>n° 1672 (pme-typologie, non validé)</w:t>
             </w:r>
           </w:p>
         </w:tc>
@@ -7083,7 +7083,7 @@
                 <w:b w:val="0"/>
                 <w:sz w:val="18"/>
               </w:rPr>
-              <w:t>n° 1351 (pme-typologie, non validé)</w:t>
+              <w:t>n° 1672 (pme-typologie, non validé)</w:t>
             </w:r>
           </w:p>
         </w:tc>

</xml_diff>